<commit_message>
chore: atualiza planilha e template de contrato de locação
Co-Authored-By: Claude Sonnet 4.6 <noreply@anthropic.com>
</commit_message>
<xml_diff>
--- a/docx_templates/CONTRATO DE LOCAÇÃO EDITADO.docx
+++ b/docx_templates/CONTRATO DE LOCAÇÃO EDITADO.docx
@@ -141,7 +141,6 @@
         </w:rPr>
         <w:t xml:space="preserve"> </w:t>
       </w:r>
-      <w:proofErr w:type="gramStart"/>
       <w:r>
         <w:rPr>
           <w:rFonts w:ascii="Times New Roman" w:eastAsia="Times New Roman" w:hAnsi="Times New Roman" w:cs="Times New Roman"/>
@@ -151,14 +150,12 @@
         </w:rPr>
         <w:t>[ ]</w:t>
       </w:r>
-      <w:proofErr w:type="gramEnd"/>
       <w:r>
         <w:rPr>
           <w:rFonts w:ascii="Times New Roman" w:eastAsia="Times New Roman" w:hAnsi="Times New Roman" w:cs="Times New Roman"/>
         </w:rPr>
         <w:t xml:space="preserve">, portador da cédula de Identidade nº </w:t>
       </w:r>
-      <w:proofErr w:type="gramStart"/>
       <w:r>
         <w:rPr>
           <w:rFonts w:ascii="Times New Roman" w:eastAsia="Times New Roman" w:hAnsi="Times New Roman" w:cs="Times New Roman"/>
@@ -168,14 +165,12 @@
         </w:rPr>
         <w:t>[ ]</w:t>
       </w:r>
-      <w:proofErr w:type="gramEnd"/>
       <w:r>
         <w:rPr>
           <w:rFonts w:ascii="Times New Roman" w:eastAsia="Times New Roman" w:hAnsi="Times New Roman" w:cs="Times New Roman"/>
         </w:rPr>
         <w:t xml:space="preserve"> e registrado no Cadastro de Pessoas Físicas sob o nº </w:t>
       </w:r>
-      <w:proofErr w:type="gramStart"/>
       <w:r>
         <w:rPr>
           <w:rFonts w:ascii="Times New Roman" w:eastAsia="Times New Roman" w:hAnsi="Times New Roman" w:cs="Times New Roman"/>
@@ -185,14 +180,12 @@
         </w:rPr>
         <w:t>[ ]</w:t>
       </w:r>
-      <w:proofErr w:type="gramEnd"/>
       <w:r>
         <w:rPr>
           <w:rFonts w:ascii="Times New Roman" w:eastAsia="Times New Roman" w:hAnsi="Times New Roman" w:cs="Times New Roman"/>
         </w:rPr>
         <w:t xml:space="preserve">, residente e domiciliado à </w:t>
       </w:r>
-      <w:proofErr w:type="gramStart"/>
       <w:r>
         <w:rPr>
           <w:rFonts w:ascii="Times New Roman" w:eastAsia="Times New Roman" w:hAnsi="Times New Roman" w:cs="Times New Roman"/>
@@ -202,7 +195,6 @@
         </w:rPr>
         <w:t>[ ]</w:t>
       </w:r>
-      <w:proofErr w:type="gramEnd"/>
       <w:r>
         <w:rPr>
           <w:rFonts w:ascii="Times New Roman" w:eastAsia="Times New Roman" w:hAnsi="Times New Roman" w:cs="Times New Roman"/>
@@ -215,15 +207,47 @@
           <w:rFonts w:ascii="Times New Roman" w:eastAsia="Times New Roman" w:hAnsi="Times New Roman" w:cs="Times New Roman"/>
           <w:highlight w:val="white"/>
         </w:rPr>
-        <w:t>CEP</w:t>
-      </w:r>
-      <w:proofErr w:type="gramStart"/>
+        <w:t>CEP:</w:t>
+      </w:r>
+      <w:r>
+        <w:rPr>
+          <w:rFonts w:ascii="Times New Roman" w:eastAsia="Times New Roman" w:hAnsi="Times New Roman" w:cs="Times New Roman"/>
+          <w:b/>
+          <w:bCs/>
+          <w:highlight w:val="yellow"/>
+        </w:rPr>
+        <w:t>[</w:t>
+      </w:r>
+      <w:r>
+        <w:rPr>
+          <w:rFonts w:ascii="Times New Roman" w:eastAsia="Times New Roman" w:hAnsi="Times New Roman" w:cs="Times New Roman"/>
+          <w:b/>
+          <w:bCs/>
+          <w:highlight w:val="yellow"/>
+        </w:rPr>
+        <w:t xml:space="preserve"> </w:t>
+      </w:r>
+      <w:r>
+        <w:rPr>
+          <w:rFonts w:ascii="Times New Roman" w:eastAsia="Times New Roman" w:hAnsi="Times New Roman" w:cs="Times New Roman"/>
+          <w:b/>
+          <w:bCs/>
+          <w:highlight w:val="yellow"/>
+        </w:rPr>
+        <w:t>]</w:t>
+      </w:r>
       <w:r>
         <w:rPr>
           <w:rFonts w:ascii="Times New Roman" w:eastAsia="Times New Roman" w:hAnsi="Times New Roman" w:cs="Times New Roman"/>
           <w:highlight w:val="white"/>
         </w:rPr>
-        <w:t>:</w:t>
+        <w:t xml:space="preserve"> </w:t>
+      </w:r>
+      <w:r>
+        <w:rPr>
+          <w:rFonts w:ascii="Times New Roman" w:eastAsia="Times New Roman" w:hAnsi="Times New Roman" w:cs="Times New Roman"/>
+        </w:rPr>
+        <w:t xml:space="preserve">com número de telefone </w:t>
       </w:r>
       <w:r>
         <w:rPr>
@@ -234,38 +258,6 @@
         </w:rPr>
         <w:t>[ ]</w:t>
       </w:r>
-      <w:proofErr w:type="gramEnd"/>
-      <w:r>
-        <w:rPr>
-          <w:rFonts w:ascii="Times New Roman" w:eastAsia="Times New Roman" w:hAnsi="Times New Roman" w:cs="Times New Roman"/>
-          <w:highlight w:val="yellow"/>
-        </w:rPr>
-        <w:t xml:space="preserve"> </w:t>
-      </w:r>
-      <w:r>
-        <w:rPr>
-          <w:rFonts w:ascii="Times New Roman" w:eastAsia="Times New Roman" w:hAnsi="Times New Roman" w:cs="Times New Roman"/>
-          <w:highlight w:val="white"/>
-        </w:rPr>
-        <w:t xml:space="preserve"> </w:t>
-      </w:r>
-      <w:r>
-        <w:rPr>
-          <w:rFonts w:ascii="Times New Roman" w:eastAsia="Times New Roman" w:hAnsi="Times New Roman" w:cs="Times New Roman"/>
-        </w:rPr>
-        <w:t xml:space="preserve">com número de telefone </w:t>
-      </w:r>
-      <w:proofErr w:type="gramStart"/>
-      <w:r>
-        <w:rPr>
-          <w:rFonts w:ascii="Times New Roman" w:eastAsia="Times New Roman" w:hAnsi="Times New Roman" w:cs="Times New Roman"/>
-          <w:b/>
-          <w:bCs/>
-          <w:highlight w:val="yellow"/>
-        </w:rPr>
-        <w:t>[ ]</w:t>
-      </w:r>
-      <w:proofErr w:type="gramEnd"/>
       <w:r>
         <w:rPr>
           <w:rFonts w:ascii="Times New Roman" w:eastAsia="Times New Roman" w:hAnsi="Times New Roman" w:cs="Times New Roman"/>
@@ -2180,7 +2172,13 @@
         <w:rPr>
           <w:rFonts w:ascii="Times New Roman" w:eastAsia="Times New Roman" w:hAnsi="Times New Roman" w:cs="Times New Roman"/>
         </w:rPr>
-        <w:t>ao processo, a fim de assumir a demanda, ou ainda, para preservar o direito de regresso.</w:t>
+        <w:t>ao processo, a fim de assumir a demand</w:t>
+      </w:r>
+      <w:r>
+        <w:rPr>
+          <w:rFonts w:ascii="Times New Roman" w:eastAsia="Times New Roman" w:hAnsi="Times New Roman" w:cs="Times New Roman"/>
+        </w:rPr>
+        <w:t>a, ou ainda, para preservar o direito de regresso.</w:t>
       </w:r>
     </w:p>
     <w:p>
@@ -3758,7 +3756,13 @@
         <w:rPr>
           <w:rFonts w:ascii="Times New Roman" w:eastAsia="Times New Roman" w:hAnsi="Times New Roman" w:cs="Times New Roman"/>
         </w:rPr>
-        <w:t>venha a ter para efetuar a busca, apreensão e efetiva reintegração da posse do Veículo.</w:t>
+        <w:t>ven</w:t>
+      </w:r>
+      <w:r>
+        <w:rPr>
+          <w:rFonts w:ascii="Times New Roman" w:eastAsia="Times New Roman" w:hAnsi="Times New Roman" w:cs="Times New Roman"/>
+        </w:rPr>
+        <w:t>ha a ter para efetuar a busca, apreensão e efetiva reintegração da posse do Veículo.</w:t>
       </w:r>
     </w:p>
     <w:p>
@@ -3832,7 +3836,13 @@
         <w:rPr>
           <w:rFonts w:ascii="Times New Roman" w:eastAsia="Times New Roman" w:hAnsi="Times New Roman" w:cs="Times New Roman"/>
         </w:rPr>
-        <w:t xml:space="preserve">Fica mutuamente acordado entre as Partes que quaisquer alterações que impliquem no aumento da carga tributária incidente sobre a Locação, tais como instituição de novos tributos, aumento de alíquotas, modificação das práticas reiteradamente observadas pelas autoridades fiscais competentes, decisões administrativas e/ou judiciais ou modificação na interpretação da legislação tributária aplicável, acarretarão a correspondente alteração no Preço, no mesmo montante do aumento das alíquotas ou dos novos tributos incidentes. A </w:t>
+        <w:t>Fica mutuamente acordado entre as Partes que quaisquer alterações que impliquem no aumento da carga tributária incidente sobre a Locação, tais como instituição de novos tributos, aumento de alíquotas, modificação das práticas reiteradamente observadas pelas autoridades fiscais competentes, decisões administrativas e/ou judiciais ou modificação na interpretação da legislação tributária aplicável, acarretarão a correspondente alteração no Preço, no mesmo montante do aumento das alíquotas ou dos novos tributos</w:t>
+      </w:r>
+      <w:r>
+        <w:rPr>
+          <w:rFonts w:ascii="Times New Roman" w:eastAsia="Times New Roman" w:hAnsi="Times New Roman" w:cs="Times New Roman"/>
+        </w:rPr>
+        <w:t xml:space="preserve"> incidentes. A </w:t>
       </w:r>
       <w:r>
         <w:rPr>
@@ -5461,7 +5471,13 @@
         <w:rPr>
           <w:rFonts w:ascii="Times New Roman" w:eastAsia="Times New Roman" w:hAnsi="Times New Roman" w:cs="Times New Roman"/>
         </w:rPr>
-        <w:t xml:space="preserve"> Todas as notificações, solicitações e avisos, entre outros, de uma Parte à outra, relacionadas a este Contrato, deverão ser feitos por escrito e serão efetivados por WhatsApp, caso em que serão considerados recebidos no primeiro dia útil subsequente à data de envio, desde que acompanhados do comprovante de envio/leitura ou verificar-se a confirmação por escrito ou por qualquer outro meio que assegure ter o destinatário recebido a comunicação ou a notificação, para as pessoas e os endereços (físicos e eletrônicos) indicados acima.</w:t>
+        <w:t xml:space="preserve"> Todas as notificações, solicitações e avisos, entre outros, de uma Parte à outra, relacionadas a este Contrato, deverão ser feitos por escrito e serão efetivados por WhatsApp, caso em que serão considerados recebidos no primeiro dia útil subsequente à data de envio, desde que acompanhados do comprovante de envio/leitura ou verificar-se a confirmação por escrito ou por qualquer outro meio que assegure ter o destinatário recebido a comunicação ou a notificação, para as pessoas e os endereços (físicos e eletr</w:t>
+      </w:r>
+      <w:r>
+        <w:rPr>
+          <w:rFonts w:ascii="Times New Roman" w:eastAsia="Times New Roman" w:hAnsi="Times New Roman" w:cs="Times New Roman"/>
+        </w:rPr>
+        <w:t>ônicos) indicados acima.</w:t>
       </w:r>
     </w:p>
     <w:p>
@@ -5886,7 +5902,13 @@
         <w:rPr>
           <w:rFonts w:ascii="Times New Roman" w:eastAsia="Times New Roman" w:hAnsi="Times New Roman" w:cs="Times New Roman"/>
         </w:rPr>
-        <w:t xml:space="preserve"> O não exercício pelas Partes de quaisquer dos direitos ou prerrogativas previstos neste Contrato ou na legislação aplicável será tido como ato de mera liberalidade, não constituindo alteração ou novação ou renúncia das obrigações ora estabelecidas, cujo cumprimento poderá ser exigido a qualquer tempo. Desta forma, o não exercício pelas Partes, em qualquer caso específico, de quaisquer direitos que lhe sejam assegurados nos termos deste Contrato ou que lhe sejam conferidos por lei, bem como a não aplicação de quaisquer multas neles previstas não importará renúncia à aplicação futura de tais direitos ou multas, em quaisquer circunstâncias, nem constituirá precedente ou alteração do presente Contrato. A eventual renúncia por quaisquer das Partes de direitos previstas neste Contrato deverá ser expressa, por escrito, datada e assinada pelo representante legal da Parte que manifestar tal renúncia.</w:t>
+        <w:t xml:space="preserve"> O não exercício pelas Partes de quaisquer dos direitos ou prerrogativas previstos neste Contrato ou na legislação aplicável será tido como ato de mera liberalidade, não constituindo alteração ou novação ou renúncia das obrigações ora estabelecidas, cujo cumprimento poderá ser exigido a qualquer tempo. Desta forma, o não exercício pelas Partes, em qualquer caso específico, de quaisquer direitos que lhe sejam assegurados nos termos deste Contrato ou que lhe sejam conferidos por lei, bem como a não aplicação </w:t>
+      </w:r>
+      <w:r>
+        <w:rPr>
+          <w:rFonts w:ascii="Times New Roman" w:eastAsia="Times New Roman" w:hAnsi="Times New Roman" w:cs="Times New Roman"/>
+        </w:rPr>
+        <w:t>de quaisquer multas neles previstas não importará renúncia à aplicação futura de tais direitos ou multas, em quaisquer circunstâncias, nem constituirá precedente ou alteração do presente Contrato. A eventual renúncia por quaisquer das Partes de direitos previstas neste Contrato deverá ser expressa, por escrito, datada e assinada pelo representante legal da Parte que manifestar tal renúncia.</w:t>
       </w:r>
     </w:p>
     <w:p>
@@ -7859,7 +7881,13 @@
         <w:rPr>
           <w:rFonts w:ascii="Times New Roman" w:eastAsia="Times New Roman" w:hAnsi="Times New Roman" w:cs="Times New Roman"/>
         </w:rPr>
-        <w:t>O veículo poderá ser monitorado por meio de sistemas de rastreamento, geolocalização e telemetria, com a finalidade de garantir a segurança da operação, localização do bem e controle de uso. O CLIENTE declara estar ciente e concordar com a coleta, tratamento e utilização dessas informações durante o período de locação, autorizando expressamente o compartilhamento dos dados com empresas responsáveis pela gestão da tecnologia utilizada pela LOCADORA. Comprometendo-se a não desativar, obstruir ou manipular tais sistemas, sob pena de suspensão imediata da proteção veicular.</w:t>
+        <w:t>O veículo poderá ser monitorado por meio de sistemas de rastreamento, geolocalização e telemetria, com a finalidade de garantir a segurança da operação, localização do bem e controle de uso. O CLIENTE declara estar ciente e concordar com a coleta, tratamento e utilização dessas informações durante o período de locação, autorizando expressamente o compartilhamento dos dados com empresas responsáveis pela gestão da tecnologia utilizada pela LOCADORA. Comprometendo-se a não desativar, obstruir ou manipular tai</w:t>
+      </w:r>
+      <w:r>
+        <w:rPr>
+          <w:rFonts w:ascii="Times New Roman" w:eastAsia="Times New Roman" w:hAnsi="Times New Roman" w:cs="Times New Roman"/>
+        </w:rPr>
+        <w:t>s sistemas, sob pena de suspensão imediata da proteção veicular.</w:t>
       </w:r>
     </w:p>
     <w:p>
@@ -8872,25 +8900,7 @@
         <w:rPr>
           <w:rFonts w:ascii="Times New Roman" w:eastAsia="Times New Roman" w:hAnsi="Times New Roman" w:cs="Times New Roman"/>
         </w:rPr>
-        <w:t>TESTEMUNHA</w:t>
-      </w:r>
-      <w:r>
-        <w:rPr>
-          <w:rFonts w:ascii="Times New Roman" w:eastAsia="Times New Roman" w:hAnsi="Times New Roman" w:cs="Times New Roman"/>
-        </w:rPr>
-        <w:t xml:space="preserve"> </w:t>
-      </w:r>
-      <w:r>
-        <w:rPr>
-          <w:rFonts w:ascii="Times New Roman" w:eastAsia="Times New Roman" w:hAnsi="Times New Roman" w:cs="Times New Roman"/>
-        </w:rPr>
-        <w:t>2</w:t>
-      </w:r>
-      <w:r>
-        <w:rPr>
-          <w:rFonts w:ascii="Times New Roman" w:eastAsia="Times New Roman" w:hAnsi="Times New Roman" w:cs="Times New Roman"/>
-        </w:rPr>
-        <w:t>:</w:t>
+        <w:t>TESTEMUNHA 2:</w:t>
       </w:r>
     </w:p>
     <w:p>

</xml_diff>